<commit_message>
Homework 2: replace data flow diagram with sequence diagram, redo architecture as pipe-and-filter
Co-Authored-By: Claude Opus 5.5 <noreply@anthropic.com>
Claude-Session: https://claude.ai/code/session_01Vyiy957Z6CY3cPCFKmxEsP
</commit_message>
<xml_diff>
--- a/CS301_Homework_2_Files_Cleaner.docx
+++ b/CS301_Homework_2_Files_Cleaner.docx
@@ -150,7 +150,7 @@
         <w:spacing w:after="120" w:before="240"/>
       </w:pPr>
       <w:r>
-        <w:t xml:space="preserve">2. Data Flow Diagram</w:t>
+        <w:t xml:space="preserve">2. Sequence Diagram</w:t>
       </w:r>
     </w:p>
     <w:p>
@@ -161,7 +161,7 @@
       <w:r>
         <w:drawing>
           <wp:inline distT="0" distB="0" distL="0" distR="0">
-            <wp:extent cx="5715000" cy="3743325"/>
+            <wp:extent cx="5715000" cy="4972050"/>
             <wp:effectExtent t="0" r="0" b="0" l="0"/>
             <wp:docPr id="1" name="" descr="" title=""/>
             <wp:cNvGraphicFramePr>
@@ -186,7 +186,7 @@
                   <pic:spPr bwMode="auto">
                     <a:xfrm>
                       <a:off x="0" y="0"/>
-                      <a:ext cx="5715000" cy="3743325"/>
+                      <a:ext cx="5715000" cy="4972050"/>
                     </a:xfrm>
                     <a:prstGeom prst="rect">
                       <a:avLst/>
@@ -213,90 +213,70 @@
           <w:b/>
           <w:bCs/>
         </w:rPr>
-        <w:t xml:space="preserve">1.0 Scan: </w:t>
-      </w:r>
-      <w:r>
-        <w:t xml:space="preserve">walks the Scan Root, skips Protected Paths (config.json + built-in OS lists).</w:t>
-      </w:r>
-    </w:p>
-    <w:p>
-      <w:pPr>
-        <w:pStyle w:val="ListParagraph"/>
-        <w:numPr>
-          <w:ilvl w:val="0"/>
-          <w:numId w:val="2"/>
-        </w:numPr>
-        <w:spacing w:after="60"/>
-      </w:pPr>
-      <w:r>
-        <w:rPr>
-          <w:b/>
-          <w:bCs/>
-        </w:rPr>
-        <w:t xml:space="preserve">2.0 Find duplicates: </w:t>
-      </w:r>
-      <w:r>
-        <w:t xml:space="preserve">groups files by size, then a partial hash, then a full BLAKE3 hash; the newest copy is the Keeper.</w:t>
-      </w:r>
-    </w:p>
-    <w:p>
-      <w:pPr>
-        <w:pStyle w:val="ListParagraph"/>
-        <w:numPr>
-          <w:ilvl w:val="0"/>
-          <w:numId w:val="2"/>
-        </w:numPr>
-        <w:spacing w:after="60"/>
-      </w:pPr>
-      <w:r>
-        <w:rPr>
-          <w:b/>
-          <w:bCs/>
-        </w:rPr>
-        <w:t xml:space="preserve">3.0 Build Plan: </w:t>
-      </w:r>
-      <w:r>
-        <w:t xml:space="preserve">one Trash Operation per extra copy, each with its Reason.</w:t>
-      </w:r>
-    </w:p>
-    <w:p>
-      <w:pPr>
-        <w:pStyle w:val="ListParagraph"/>
-        <w:numPr>
-          <w:ilvl w:val="0"/>
-          <w:numId w:val="2"/>
-        </w:numPr>
-        <w:spacing w:after="60"/>
-      </w:pPr>
-      <w:r>
-        <w:rPr>
-          <w:b/>
-          <w:bCs/>
-        </w:rPr>
-        <w:t xml:space="preserve">4.0 Run Plan: </w:t>
-      </w:r>
-      <w:r>
-        <w:t xml:space="preserve">for each approved Operation, writes an intent to the Journal, moves the file to the Holding Folder, then records the outcome.</w:t>
-      </w:r>
-    </w:p>
-    <w:p>
-      <w:pPr>
-        <w:pStyle w:val="ListParagraph"/>
-        <w:numPr>
-          <w:ilvl w:val="0"/>
-          <w:numId w:val="2"/>
-        </w:numPr>
-        <w:spacing w:after="60"/>
-      </w:pPr>
-      <w:r>
-        <w:rPr>
-          <w:b/>
-          <w:bCs/>
-        </w:rPr>
-        <w:t xml:space="preserve">5.0 Undo/Redo: </w:t>
-      </w:r>
-      <w:r>
-        <w:t xml:space="preserve">reads the Journal and moves items back (or forward), never overwriting.</w:t>
+        <w:t xml:space="preserve">Scan (1–4): </w:t>
+      </w:r>
+      <w:r>
+        <w:t xml:space="preserve">the Scanner walks the Scan Root and skips Protected Paths.</w:t>
+      </w:r>
+    </w:p>
+    <w:p>
+      <w:pPr>
+        <w:pStyle w:val="ListParagraph"/>
+        <w:numPr>
+          <w:ilvl w:val="0"/>
+          <w:numId w:val="2"/>
+        </w:numPr>
+        <w:spacing w:after="60"/>
+      </w:pPr>
+      <w:r>
+        <w:rPr>
+          <w:b/>
+          <w:bCs/>
+        </w:rPr>
+        <w:t xml:space="preserve">Plan (5–10): </w:t>
+      </w:r>
+      <w:r>
+        <w:t xml:space="preserve">the Duplicate Finder narrows files by size, partial hash, then full hash; the Planner turns each extra copy into a Trash Operation.</w:t>
+      </w:r>
+    </w:p>
+    <w:p>
+      <w:pPr>
+        <w:pStyle w:val="ListParagraph"/>
+        <w:numPr>
+          <w:ilvl w:val="0"/>
+          <w:numId w:val="2"/>
+        </w:numPr>
+        <w:spacing w:after="60"/>
+      </w:pPr>
+      <w:r>
+        <w:rPr>
+          <w:b/>
+          <w:bCs/>
+        </w:rPr>
+        <w:t xml:space="preserve">Run (11–17): </w:t>
+      </w:r>
+      <w:r>
+        <w:t xml:space="preserve">for each approved Operation, the Executor journals the intent, moves the file to the Holding Folder, then journals the outcome.</w:t>
+      </w:r>
+    </w:p>
+    <w:p>
+      <w:pPr>
+        <w:pStyle w:val="ListParagraph"/>
+        <w:numPr>
+          <w:ilvl w:val="0"/>
+          <w:numId w:val="2"/>
+        </w:numPr>
+        <w:spacing w:after="60"/>
+      </w:pPr>
+      <w:r>
+        <w:rPr>
+          <w:b/>
+          <w:bCs/>
+        </w:rPr>
+        <w:t xml:space="preserve">Undo (18–22): </w:t>
+      </w:r>
+      <w:r>
+        <w:t xml:space="preserve">the Executor replays the Journal backwards and moves items back.</w:t>
       </w:r>
     </w:p>
     <w:p>
@@ -316,7 +296,7 @@
       <w:r>
         <w:drawing>
           <wp:inline distT="0" distB="0" distL="0" distR="0">
-            <wp:extent cx="5715000" cy="3095625"/>
+            <wp:extent cx="5715000" cy="2619375"/>
             <wp:effectExtent t="0" r="0" b="0" l="0"/>
             <wp:docPr id="1" name="" descr="" title=""/>
             <wp:cNvGraphicFramePr>
@@ -341,7 +321,7 @@
                   <pic:spPr bwMode="auto">
                     <a:xfrm>
                       <a:off x="0" y="0"/>
-                      <a:ext cx="5715000" cy="3095625"/>
+                      <a:ext cx="5715000" cy="2619375"/>
                     </a:xfrm>
                     <a:prstGeom prst="rect">
                       <a:avLst/>
@@ -366,7 +346,7 @@
         <w:t xml:space="preserve">Style: </w:t>
       </w:r>
       <w:r>
-        <w:t xml:space="preserve">pipe-and-filter, inside a thin layered desktop shell (UI → Tauri commands → Rust core).</w:t>
+        <w:t xml:space="preserve">Pipe-and-Filter. Data flows one way from a pump, through independent filters joined by pipes, to a sink.</w:t>
       </w:r>
     </w:p>
     <w:p>
@@ -395,10 +375,30 @@
           <w:b/>
           <w:bCs/>
         </w:rPr>
+        <w:t xml:space="preserve">Pump: </w:t>
+      </w:r>
+      <w:r>
+        <w:t xml:space="preserve">the Scan Root folder.</w:t>
+      </w:r>
+    </w:p>
+    <w:p>
+      <w:pPr>
+        <w:pStyle w:val="ListParagraph"/>
+        <w:numPr>
+          <w:ilvl w:val="0"/>
+          <w:numId w:val="2"/>
+        </w:numPr>
+        <w:spacing w:after="60"/>
+      </w:pPr>
+      <w:r>
+        <w:rPr>
+          <w:b/>
+          <w:bCs/>
+        </w:rPr>
         <w:t xml:space="preserve">Filters: </w:t>
       </w:r>
       <w:r>
-        <w:t xml:space="preserve">Scanner → Duplicate Finder → Planner → User review → Executor. Each is one core module (scanner.rs, duplicates.rs, planner.rs, executor.rs).</w:t>
+        <w:t xml:space="preserve">F1 Scan, F2 Size, F3 Partial hash, F4 Full hash, F5 Keeper, F6 Planner, F7 Approval, F8 Executor. Each does one transformation.</w:t>
       </w:r>
     </w:p>
     <w:p>
@@ -418,47 +418,27 @@
         <w:t xml:space="preserve">Pipes: </w:t>
       </w:r>
       <w:r>
-        <w:t xml:space="preserve">typed data passed between them: ScanResult, Duplicate Groups, Plan, approved IDs, Summary.</w:t>
-      </w:r>
-    </w:p>
-    <w:p>
-      <w:pPr>
-        <w:pStyle w:val="ListParagraph"/>
-        <w:numPr>
-          <w:ilvl w:val="0"/>
-          <w:numId w:val="2"/>
-        </w:numPr>
-        <w:spacing w:after="60"/>
-      </w:pPr>
-      <w:r>
-        <w:rPr>
-          <w:b/>
-          <w:bCs/>
-        </w:rPr>
-        <w:t xml:space="preserve">Stores: </w:t>
-      </w:r>
-      <w:r>
-        <w:t xml:space="preserve">config.json (settings) and one JSON-lines Journal per Session.</w:t>
-      </w:r>
-    </w:p>
-    <w:p>
-      <w:pPr>
-        <w:pStyle w:val="ListParagraph"/>
-        <w:numPr>
-          <w:ilvl w:val="0"/>
-          <w:numId w:val="2"/>
-        </w:numPr>
-        <w:spacing w:after="60"/>
-      </w:pPr>
-      <w:r>
-        <w:rPr>
-          <w:b/>
-          <w:bCs/>
-        </w:rPr>
-        <w:t xml:space="preserve">Shell: </w:t>
-      </w:r>
-      <w:r>
-        <w:t xml:space="preserve">plain HTML/JS screens call the core through Tauri commands.</w:t>
+        <w:t xml:space="preserve">typed data between filters: ScanEntries → candidate groups → Duplicate Groups → Plan → approved Operations → Outcomes.</w:t>
+      </w:r>
+    </w:p>
+    <w:p>
+      <w:pPr>
+        <w:pStyle w:val="ListParagraph"/>
+        <w:numPr>
+          <w:ilvl w:val="0"/>
+          <w:numId w:val="2"/>
+        </w:numPr>
+        <w:spacing w:after="60"/>
+      </w:pPr>
+      <w:r>
+        <w:rPr>
+          <w:b/>
+          <w:bCs/>
+        </w:rPr>
+        <w:t xml:space="preserve">Sink: </w:t>
+      </w:r>
+      <w:r>
+        <w:t xml:space="preserve">the Holding Folder (trashed copies) and the Session Journal.</w:t>
       </w:r>
     </w:p>
     <w:p>
@@ -487,30 +467,30 @@
           <w:b/>
           <w:bCs/>
         </w:rPr>
-        <w:t xml:space="preserve">Matches the problem: </w:t>
-      </w:r>
-      <w:r>
-        <w:t xml:space="preserve">cleaning is a one-way flow that narrows data step by step. Even the Duplicate Finder is a chain of filters (size → partial hash → full hash), so most files are never fully read.</w:t>
-      </w:r>
-    </w:p>
-    <w:p>
-      <w:pPr>
-        <w:pStyle w:val="ListParagraph"/>
-        <w:numPr>
-          <w:ilvl w:val="0"/>
-          <w:numId w:val="2"/>
-        </w:numPr>
-        <w:spacing w:after="60"/>
-      </w:pPr>
-      <w:r>
-        <w:rPr>
-          <w:b/>
-          <w:bCs/>
-        </w:rPr>
-        <w:t xml:space="preserve">Easy to extend: </w:t>
-      </w:r>
-      <w:r>
-        <w:t xml:space="preserve">Suggested Folders is a new planner filter that reuses the same Scanner, review and Executor.</w:t>
+        <w:t xml:space="preserve">Fits the task: </w:t>
+      </w:r>
+      <w:r>
+        <w:t xml:space="preserve">cleaning is a one-way flow where each step shrinks the data. F2–F4 drop non-duplicates cheaply, so most files are never fully read.</w:t>
+      </w:r>
+    </w:p>
+    <w:p>
+      <w:pPr>
+        <w:pStyle w:val="ListParagraph"/>
+        <w:numPr>
+          <w:ilvl w:val="0"/>
+          <w:numId w:val="2"/>
+        </w:numPr>
+        <w:spacing w:after="60"/>
+      </w:pPr>
+      <w:r>
+        <w:rPr>
+          <w:b/>
+          <w:bCs/>
+        </w:rPr>
+        <w:t xml:space="preserve">Reusable and extensible: </w:t>
+      </w:r>
+      <w:r>
+        <w:t xml:space="preserve">filters are independent. Suggested Folders will be a new planner filter on the same F1, F7 and F8.</w:t>
       </w:r>
     </w:p>
     <w:p>
@@ -530,7 +510,7 @@
         <w:t xml:space="preserve">Testable: </w:t>
       </w:r>
       <w:r>
-        <w:t xml:space="preserve">each filter has a clear input and output, and the core has no Tauri dependency, so it is tested with plain cargo test.</w:t>
+        <w:t xml:space="preserve">each filter has one input and one output, so it is unit-tested alone.</w:t>
       </w:r>
     </w:p>
     <w:p>
@@ -550,7 +530,7 @@
         <w:t xml:space="preserve">Safe: </w:t>
       </w:r>
       <w:r>
-        <w:t xml:space="preserve">the Executor is the only filter that touches the disk, and it journals before every move, so any Session can be undone.</w:t>
+        <w:t xml:space="preserve">only F8 touches the disk, and it journals before every move, so any Session can be undone.</w:t>
       </w:r>
     </w:p>
     <w:sectPr>

</xml_diff>

<commit_message>
Homework 2: simpler plain-language sequence diagram, GfG-style pipe-and-filter sketch
Co-Authored-By: Claude Opus 5.5 <noreply@anthropic.com>
Claude-Session: https://claude.ai/code/session_01Vyiy957Z6CY3cPCFKmxEsP
</commit_message>
<xml_diff>
--- a/CS301_Homework_2_Files_Cleaner.docx
+++ b/CS301_Homework_2_Files_Cleaner.docx
@@ -161,7 +161,7 @@
       <w:r>
         <w:drawing>
           <wp:inline distT="0" distB="0" distL="0" distR="0">
-            <wp:extent cx="5715000" cy="4972050"/>
+            <wp:extent cx="5715000" cy="4267200"/>
             <wp:effectExtent t="0" r="0" b="0" l="0"/>
             <wp:docPr id="1" name="" descr="" title=""/>
             <wp:cNvGraphicFramePr>
@@ -186,7 +186,7 @@
                   <pic:spPr bwMode="auto">
                     <a:xfrm>
                       <a:off x="0" y="0"/>
-                      <a:ext cx="5715000" cy="4972050"/>
+                      <a:ext cx="5715000" cy="4267200"/>
                     </a:xfrm>
                     <a:prstGeom prst="rect">
                       <a:avLst/>
@@ -201,82 +201,70 @@
     </w:p>
     <w:p>
       <w:pPr>
-        <w:pStyle w:val="ListParagraph"/>
-        <w:numPr>
-          <w:ilvl w:val="0"/>
-          <w:numId w:val="2"/>
-        </w:numPr>
-        <w:spacing w:after="60"/>
-      </w:pPr>
-      <w:r>
-        <w:rPr>
-          <w:b/>
-          <w:bCs/>
-        </w:rPr>
-        <w:t xml:space="preserve">Scan (1–4): </w:t>
-      </w:r>
-      <w:r>
-        <w:t xml:space="preserve">the Scanner walks the Scan Root and skips Protected Paths.</w:t>
-      </w:r>
-    </w:p>
-    <w:p>
-      <w:pPr>
-        <w:pStyle w:val="ListParagraph"/>
-        <w:numPr>
-          <w:ilvl w:val="0"/>
-          <w:numId w:val="2"/>
-        </w:numPr>
-        <w:spacing w:after="60"/>
-      </w:pPr>
-      <w:r>
-        <w:rPr>
-          <w:b/>
-          <w:bCs/>
-        </w:rPr>
-        <w:t xml:space="preserve">Plan (5–10): </w:t>
-      </w:r>
-      <w:r>
-        <w:t xml:space="preserve">the Duplicate Finder narrows files by size, partial hash, then full hash; the Planner turns each extra copy into a Trash Operation.</w:t>
-      </w:r>
-    </w:p>
-    <w:p>
-      <w:pPr>
-        <w:pStyle w:val="ListParagraph"/>
-        <w:numPr>
-          <w:ilvl w:val="0"/>
-          <w:numId w:val="2"/>
-        </w:numPr>
-        <w:spacing w:after="60"/>
-      </w:pPr>
-      <w:r>
-        <w:rPr>
-          <w:b/>
-          <w:bCs/>
-        </w:rPr>
-        <w:t xml:space="preserve">Run (11–17): </w:t>
-      </w:r>
-      <w:r>
-        <w:t xml:space="preserve">for each approved Operation, the Executor journals the intent, moves the file to the Holding Folder, then journals the outcome.</w:t>
-      </w:r>
-    </w:p>
-    <w:p>
-      <w:pPr>
-        <w:pStyle w:val="ListParagraph"/>
-        <w:numPr>
-          <w:ilvl w:val="0"/>
-          <w:numId w:val="2"/>
-        </w:numPr>
-        <w:spacing w:after="60"/>
-      </w:pPr>
-      <w:r>
-        <w:rPr>
-          <w:b/>
-          <w:bCs/>
-        </w:rPr>
-        <w:t xml:space="preserve">Undo (18–22): </w:t>
-      </w:r>
-      <w:r>
-        <w:t xml:space="preserve">the Executor replays the Journal backwards and moves items back.</w:t>
+        <w:spacing w:after="100"/>
+      </w:pPr>
+      <w:r>
+        <w:t xml:space="preserve">The user picks a folder. The app finds files with identical content, shows a plan, and moves the extra copies only after the user approves.</w:t>
+      </w:r>
+    </w:p>
+    <w:p>
+      <w:pPr>
+        <w:pStyle w:val="ListParagraph"/>
+        <w:numPr>
+          <w:ilvl w:val="0"/>
+          <w:numId w:val="2"/>
+        </w:numPr>
+        <w:spacing w:after="60"/>
+      </w:pPr>
+      <w:r>
+        <w:rPr>
+          <w:b/>
+          <w:bCs/>
+        </w:rPr>
+        <w:t xml:space="preserve">Steps 2–3: </w:t>
+      </w:r>
+      <w:r>
+        <w:t xml:space="preserve">system and app files (e.g. Windows, Library, .git) are left out of the list, so the app can never break the computer or other programs.</w:t>
+      </w:r>
+    </w:p>
+    <w:p>
+      <w:pPr>
+        <w:pStyle w:val="ListParagraph"/>
+        <w:numPr>
+          <w:ilvl w:val="0"/>
+          <w:numId w:val="2"/>
+        </w:numPr>
+        <w:spacing w:after="60"/>
+      </w:pPr>
+      <w:r>
+        <w:rPr>
+          <w:b/>
+          <w:bCs/>
+        </w:rPr>
+        <w:t xml:space="preserve">Steps 8–9: </w:t>
+      </w:r>
+      <w:r>
+        <w:t xml:space="preserve">each move is written to the undo log before it happens, so Undo works even after a crash.</w:t>
+      </w:r>
+    </w:p>
+    <w:p>
+      <w:pPr>
+        <w:pStyle w:val="ListParagraph"/>
+        <w:numPr>
+          <w:ilvl w:val="0"/>
+          <w:numId w:val="2"/>
+        </w:numPr>
+        <w:spacing w:after="60"/>
+      </w:pPr>
+      <w:r>
+        <w:rPr>
+          <w:b/>
+          <w:bCs/>
+        </w:rPr>
+        <w:t xml:space="preserve">Steps 11–13: </w:t>
+      </w:r>
+      <w:r>
+        <w:t xml:space="preserve">Undo reads the log and moves every file back.</w:t>
       </w:r>
     </w:p>
     <w:p>
@@ -296,7 +284,7 @@
       <w:r>
         <w:drawing>
           <wp:inline distT="0" distB="0" distL="0" distR="0">
-            <wp:extent cx="5715000" cy="2619375"/>
+            <wp:extent cx="5715000" cy="2276475"/>
             <wp:effectExtent t="0" r="0" b="0" l="0"/>
             <wp:docPr id="1" name="" descr="" title=""/>
             <wp:cNvGraphicFramePr>
@@ -321,7 +309,7 @@
                   <pic:spPr bwMode="auto">
                     <a:xfrm>
                       <a:off x="0" y="0"/>
-                      <a:ext cx="5715000" cy="2619375"/>
+                      <a:ext cx="5715000" cy="2276475"/>
                     </a:xfrm>
                     <a:prstGeom prst="rect">
                       <a:avLst/>
@@ -346,7 +334,87 @@
         <w:t xml:space="preserve">Style: </w:t>
       </w:r>
       <w:r>
-        <w:t xml:space="preserve">Pipe-and-Filter. Data flows one way from a pump, through independent filters joined by pipes, to a sink.</w:t>
+        <w:t xml:space="preserve">Pipe-and-Filter. A pump feeds data through filters, linked by pipes, into a sink.</w:t>
+      </w:r>
+    </w:p>
+    <w:p>
+      <w:pPr>
+        <w:pStyle w:val="ListParagraph"/>
+        <w:numPr>
+          <w:ilvl w:val="0"/>
+          <w:numId w:val="2"/>
+        </w:numPr>
+        <w:spacing w:after="60"/>
+      </w:pPr>
+      <w:r>
+        <w:rPr>
+          <w:b/>
+          <w:bCs/>
+        </w:rPr>
+        <w:t xml:space="preserve">Pump: </w:t>
+      </w:r>
+      <w:r>
+        <w:t xml:space="preserve">the folder the user chose.</w:t>
+      </w:r>
+    </w:p>
+    <w:p>
+      <w:pPr>
+        <w:pStyle w:val="ListParagraph"/>
+        <w:numPr>
+          <w:ilvl w:val="0"/>
+          <w:numId w:val="2"/>
+        </w:numPr>
+        <w:spacing w:after="60"/>
+      </w:pPr>
+      <w:r>
+        <w:rPr>
+          <w:b/>
+          <w:bCs/>
+        </w:rPr>
+        <w:t xml:space="preserve">Filters: </w:t>
+      </w:r>
+      <w:r>
+        <w:t xml:space="preserve">List files → Group by size → Compare ends → Compare content → Pick keeper → Make plan → User approval → Move extras. Each does one job.</w:t>
+      </w:r>
+    </w:p>
+    <w:p>
+      <w:pPr>
+        <w:pStyle w:val="ListParagraph"/>
+        <w:numPr>
+          <w:ilvl w:val="0"/>
+          <w:numId w:val="2"/>
+        </w:numPr>
+        <w:spacing w:after="60"/>
+      </w:pPr>
+      <w:r>
+        <w:rPr>
+          <w:b/>
+          <w:bCs/>
+        </w:rPr>
+        <w:t xml:space="preserve">Pipes: </w:t>
+      </w:r>
+      <w:r>
+        <w:t xml:space="preserve">carry each filter’s output to the next (files, groups, plan, approved moves).</w:t>
+      </w:r>
+    </w:p>
+    <w:p>
+      <w:pPr>
+        <w:pStyle w:val="ListParagraph"/>
+        <w:numPr>
+          <w:ilvl w:val="0"/>
+          <w:numId w:val="2"/>
+        </w:numPr>
+        <w:spacing w:after="60"/>
+      </w:pPr>
+      <w:r>
+        <w:rPr>
+          <w:b/>
+          <w:bCs/>
+        </w:rPr>
+        <w:t xml:space="preserve">Sink: </w:t>
+      </w:r>
+      <w:r>
+        <w:t xml:space="preserve">the trash folder holding the extra copies, plus the undo log.</w:t>
       </w:r>
     </w:p>
     <w:p>
@@ -358,179 +426,87 @@
           <w:b/>
           <w:bCs/>
         </w:rPr>
-        <w:t xml:space="preserve">Components</w:t>
-      </w:r>
-    </w:p>
-    <w:p>
-      <w:pPr>
-        <w:pStyle w:val="ListParagraph"/>
-        <w:numPr>
-          <w:ilvl w:val="0"/>
-          <w:numId w:val="2"/>
-        </w:numPr>
-        <w:spacing w:after="60"/>
-      </w:pPr>
-      <w:r>
-        <w:rPr>
-          <w:b/>
-          <w:bCs/>
-        </w:rPr>
-        <w:t xml:space="preserve">Pump: </w:t>
-      </w:r>
-      <w:r>
-        <w:t xml:space="preserve">the Scan Root folder.</w:t>
-      </w:r>
-    </w:p>
-    <w:p>
-      <w:pPr>
-        <w:pStyle w:val="ListParagraph"/>
-        <w:numPr>
-          <w:ilvl w:val="0"/>
-          <w:numId w:val="2"/>
-        </w:numPr>
-        <w:spacing w:after="60"/>
-      </w:pPr>
-      <w:r>
-        <w:rPr>
-          <w:b/>
-          <w:bCs/>
-        </w:rPr>
-        <w:t xml:space="preserve">Filters: </w:t>
-      </w:r>
-      <w:r>
-        <w:t xml:space="preserve">F1 Scan, F2 Size, F3 Partial hash, F4 Full hash, F5 Keeper, F6 Planner, F7 Approval, F8 Executor. Each does one transformation.</w:t>
-      </w:r>
-    </w:p>
-    <w:p>
-      <w:pPr>
-        <w:pStyle w:val="ListParagraph"/>
-        <w:numPr>
-          <w:ilvl w:val="0"/>
-          <w:numId w:val="2"/>
-        </w:numPr>
-        <w:spacing w:after="60"/>
-      </w:pPr>
-      <w:r>
-        <w:rPr>
-          <w:b/>
-          <w:bCs/>
-        </w:rPr>
-        <w:t xml:space="preserve">Pipes: </w:t>
-      </w:r>
-      <w:r>
-        <w:t xml:space="preserve">typed data between filters: ScanEntries → candidate groups → Duplicate Groups → Plan → approved Operations → Outcomes.</w:t>
-      </w:r>
-    </w:p>
-    <w:p>
-      <w:pPr>
-        <w:pStyle w:val="ListParagraph"/>
-        <w:numPr>
-          <w:ilvl w:val="0"/>
-          <w:numId w:val="2"/>
-        </w:numPr>
-        <w:spacing w:after="60"/>
-      </w:pPr>
-      <w:r>
-        <w:rPr>
-          <w:b/>
-          <w:bCs/>
-        </w:rPr>
-        <w:t xml:space="preserve">Sink: </w:t>
-      </w:r>
-      <w:r>
-        <w:t xml:space="preserve">the Holding Folder (trashed copies) and the Session Journal.</w:t>
-      </w:r>
-    </w:p>
-    <w:p>
-      <w:pPr>
-        <w:spacing w:after="100"/>
-      </w:pPr>
-      <w:r>
-        <w:rPr>
-          <w:b/>
-          <w:bCs/>
-        </w:rPr>
-        <w:t xml:space="preserve">Why</w:t>
-      </w:r>
-    </w:p>
-    <w:p>
-      <w:pPr>
-        <w:pStyle w:val="ListParagraph"/>
-        <w:numPr>
-          <w:ilvl w:val="0"/>
-          <w:numId w:val="2"/>
-        </w:numPr>
-        <w:spacing w:after="60"/>
-      </w:pPr>
-      <w:r>
-        <w:rPr>
-          <w:b/>
-          <w:bCs/>
-        </w:rPr>
-        <w:t xml:space="preserve">Fits the task: </w:t>
-      </w:r>
-      <w:r>
-        <w:t xml:space="preserve">cleaning is a one-way flow where each step shrinks the data. F2–F4 drop non-duplicates cheaply, so most files are never fully read.</w:t>
-      </w:r>
-    </w:p>
-    <w:p>
-      <w:pPr>
-        <w:pStyle w:val="ListParagraph"/>
-        <w:numPr>
-          <w:ilvl w:val="0"/>
-          <w:numId w:val="2"/>
-        </w:numPr>
-        <w:spacing w:after="60"/>
-      </w:pPr>
-      <w:r>
-        <w:rPr>
-          <w:b/>
-          <w:bCs/>
-        </w:rPr>
-        <w:t xml:space="preserve">Reusable and extensible: </w:t>
-      </w:r>
-      <w:r>
-        <w:t xml:space="preserve">filters are independent. Suggested Folders will be a new planner filter on the same F1, F7 and F8.</w:t>
-      </w:r>
-    </w:p>
-    <w:p>
-      <w:pPr>
-        <w:pStyle w:val="ListParagraph"/>
-        <w:numPr>
-          <w:ilvl w:val="0"/>
-          <w:numId w:val="2"/>
-        </w:numPr>
-        <w:spacing w:after="60"/>
-      </w:pPr>
-      <w:r>
-        <w:rPr>
-          <w:b/>
-          <w:bCs/>
-        </w:rPr>
-        <w:t xml:space="preserve">Testable: </w:t>
-      </w:r>
-      <w:r>
-        <w:t xml:space="preserve">each filter has one input and one output, so it is unit-tested alone.</w:t>
-      </w:r>
-    </w:p>
-    <w:p>
-      <w:pPr>
-        <w:pStyle w:val="ListParagraph"/>
-        <w:numPr>
-          <w:ilvl w:val="0"/>
-          <w:numId w:val="2"/>
-        </w:numPr>
-        <w:spacing w:after="60"/>
-      </w:pPr>
-      <w:r>
-        <w:rPr>
-          <w:b/>
-          <w:bCs/>
-        </w:rPr>
-        <w:t xml:space="preserve">Safe: </w:t>
-      </w:r>
-      <w:r>
-        <w:t xml:space="preserve">only F8 touches the disk, and it journals before every move, so any Session can be undone.</w:t>
+        <w:t xml:space="preserve">Why this style</w:t>
+      </w:r>
+    </w:p>
+    <w:p>
+      <w:pPr>
+        <w:pStyle w:val="ListParagraph"/>
+        <w:numPr>
+          <w:ilvl w:val="0"/>
+          <w:numId w:val="2"/>
+        </w:numPr>
+        <w:spacing w:after="60"/>
+      </w:pPr>
+      <w:r>
+        <w:rPr>
+          <w:b/>
+          <w:bCs/>
+        </w:rPr>
+        <w:t xml:space="preserve">Sequential data: </w:t>
+      </w:r>
+      <w:r>
+        <w:t xml:space="preserve">cleaning is a one-way flow where each step narrows the data, so cheap checks (size) run before costly ones (full read).</w:t>
+      </w:r>
+    </w:p>
+    <w:p>
+      <w:pPr>
+        <w:pStyle w:val="ListParagraph"/>
+        <w:numPr>
+          <w:ilvl w:val="0"/>
+          <w:numId w:val="2"/>
+        </w:numPr>
+        <w:spacing w:after="60"/>
+      </w:pPr>
+      <w:r>
+        <w:rPr>
+          <w:b/>
+          <w:bCs/>
+        </w:rPr>
+        <w:t xml:space="preserve">Modular: </w:t>
+      </w:r>
+      <w:r>
+        <w:t xml:space="preserve">each filter is a separate module, tested on its own.</w:t>
+      </w:r>
+    </w:p>
+    <w:p>
+      <w:pPr>
+        <w:pStyle w:val="ListParagraph"/>
+        <w:numPr>
+          <w:ilvl w:val="0"/>
+          <w:numId w:val="2"/>
+        </w:numPr>
+        <w:spacing w:after="60"/>
+      </w:pPr>
+      <w:r>
+        <w:rPr>
+          <w:b/>
+          <w:bCs/>
+        </w:rPr>
+        <w:t xml:space="preserve">Composable: </w:t>
+      </w:r>
+      <w:r>
+        <w:t xml:space="preserve">a future “Suggested Folders” feature adds a new planning filter and reuses the rest.</w:t>
+      </w:r>
+    </w:p>
+    <w:p>
+      <w:pPr>
+        <w:pStyle w:val="ListParagraph"/>
+        <w:numPr>
+          <w:ilvl w:val="0"/>
+          <w:numId w:val="2"/>
+        </w:numPr>
+        <w:spacing w:after="60"/>
+      </w:pPr>
+      <w:r>
+        <w:rPr>
+          <w:b/>
+          <w:bCs/>
+        </w:rPr>
+        <w:t xml:space="preserve">Fault isolation: </w:t>
+      </w:r>
+      <w:r>
+        <w:t xml:space="preserve">only the last filter changes the disk, and it logs first, so any run can be undone.</w:t>
       </w:r>
     </w:p>
     <w:sectPr>

</xml_diff>